<commit_message>
docs: update SharedSpend project documentation
</commit_message>
<xml_diff>
--- a/sharedspend/sharedspend-handoff.docx
+++ b/sharedspend/sharedspend-handoff.docx
@@ -12,17 +12,12 @@
     </w:p>
     <w:p>
       <w:r>
-        <w:rPr>
-          <w:i/>
-          <w:color w:val="5A6470"/>
-          <w:sz w:val="18"/>
-        </w:rPr>
-        <w:t>Current project state and developer guide | Verified 24 September 2026</w:t>
-      </w:r>
-    </w:p>
-    <w:p>
-      <w:r>
-        <w:t>This is the working handoff for the SharedSpend-clone development checkout. It describes the intended product, current code and data boundaries, verified feature status, known gaps, and the next safe steps. The implementation tracker remains the detailed checklist. Where tracker labels conflict with observable code or validation, this document calls out the discrepancy instead of treating a test or status mark as proof.</w:t>
+        <w:t>Current project state and developer guide | Reviewed 24 September 2026</w:t>
+      </w:r>
+    </w:p>
+    <w:p>
+      <w:r>
+        <w:t>This is the working handoff for the SharedSpend-clone development checkout. It describes the intended product, current code and data boundaries, implementation and verification status, known gaps, and next steps. The implementation tracker remains the detailed checklist. IMPLEMENTED means code exists; VERIFIED means the named evidence was recorded; PENDING means implementation, validation, or a decision remains open. A test does not verify an untested browser flow or database provider.</w:t>
       </w:r>
     </w:p>
     <w:tbl>
@@ -156,7 +151,7 @@
           </w:tcPr>
           <w:p>
             <w:r>
-              <w:t>Multiple groups, settlement and analytics exist; export, budget carry-forward, alerts, dark-mode review and E2E gate still need validation/decisions.</w:t>
+              <w:t>2.1–2.4 implemented and automated-tested; CSV user-reported working; budget copy, full UI review, browser E2E and live PostgreSQL still open.</w:t>
             </w:r>
           </w:p>
         </w:tc>
@@ -236,6 +231,338 @@
       <w:pPr>
         <w:spacing w:after="20"/>
       </w:pPr>
+    </w:p>
+    <w:p>
+      <w:r>
+        <w:t>BASELINE  The local checkout is on main at 77f7183, with local origin/main pointing to the same commit. The application implementation is 18d6fe3; 77f7183 added environment-example guidance. Direct GitHub remote inspection was unavailable in this environment, so the live remote tip was not independently refreshed. The checked-out baseline does not mean live PostgreSQL or every manual acceptance check has been verified.</w:t>
+      </w:r>
+    </w:p>
+    <w:p>
+      <w:pPr>
+        <w:pStyle w:val="Heading1"/>
+      </w:pPr>
+      <w:r>
+        <w:t>1. Project overview and purpose</w:t>
+      </w:r>
+    </w:p>
+    <w:p>
+      <w:r>
+        <w:t>SharedSpend is a household, friends, or family expense tracker. Members maintain a shared group budget and shared expenses while each person can track private personal expenses. It provides categorization, period-based reporting, dashboard, settlement tracking, and exports. It is intended for a small trusted circle, not a public multi-tenant SaaS product.</w:t>
+      </w:r>
+    </w:p>
+    <w:p>
+      <w:pPr>
+        <w:pStyle w:val="Heading1"/>
+      </w:pPr>
+      <w:r>
+        <w:t>2. Current product decision</w:t>
+      </w:r>
+    </w:p>
+    <w:p>
+      <w:r>
+        <w:rPr>
+          <w:b/>
+          <w:color w:val="1F7048"/>
+        </w:rPr>
+        <w:t xml:space="preserve">DONE  </w:t>
+      </w:r>
+      <w:r>
+        <w:t>The product direction is personal use by the owner and invited friends/family. Keep the product small, private, understandable, and affordable.</w:t>
+      </w:r>
+    </w:p>
+    <w:p>
+      <w:pPr>
+        <w:pStyle w:val="Heading2"/>
+      </w:pPr>
+      <w:r>
+        <w:t>What this means</w:t>
+      </w:r>
+    </w:p>
+    <w:p>
+      <w:r>
+        <w:t>•  Scope: prioritize accurate groups, budgets, transactions, privacy, settlement, exports, and reliable access across the owner’s devices. Treat advanced automation and SaaS features as optional.</w:t>
+      </w:r>
+    </w:p>
+    <w:p>
+      <w:r>
+        <w:t>•  Privacy: personal transactions are private to the user who recorded them. Shared data is visible to authorized group members. Do not add public sharing or cross-group visibility without a design decision.</w:t>
+      </w:r>
+    </w:p>
+    <w:p>
+      <w:r>
+        <w:t>•  Deployment: one-device local use can use SQLite. Multiple machines need the same reachable backend and database; copying SQLite files is not synchronization.</w:t>
+      </w:r>
+    </w:p>
+    <w:p>
+      <w:r>
+        <w:t>•  Admin: global admin exists as an operational control for a centrally shared database. Decide whether one maintainer needs it; do not assume every household needs it.</w:t>
+      </w:r>
+    </w:p>
+    <w:p>
+      <w:r>
+        <w:t>•  Monetization: none is approved. No subscriptions, ads, paid tiers, or SaaS billing are in scope.</w:t>
+      </w:r>
+    </w:p>
+    <w:p>
+      <w:r>
+        <w:t>•  Infrastructure: Neon Free is the current PostgreSQL direction, but live integration is unverified. Backups, TLS, secret handling, and recovery matter even for a private deployment.</w:t>
+      </w:r>
+    </w:p>
+    <w:p>
+      <w:r>
+        <w:t>IMPLEMENTED, NOT VERIFIED  PostgreSQL/Neon URL handling and migrations exist, but live integration is unverified. NEEDS DECISION  Decide whether the global admin UI remains necessary for one trusted maintainer; do not expand it into public-SaaS administration.</w:t>
+      </w:r>
+    </w:p>
+    <w:p>
+      <w:pPr>
+        <w:pStyle w:val="Heading1"/>
+      </w:pPr>
+      <w:r>
+        <w:t>3. Current architecture</w:t>
+      </w:r>
+    </w:p>
+    <w:p>
+      <w:r>
+        <w:t>•  Frontend: React 19, TypeScript, Vite 8, Tailwind CSS, existing shadcn-style components, React Router, TanStack Query, Axios, and Recharts. Typed domain clients live in frontend/src/api; screens in frontend/src/pages; shared UI in frontend/src/components.</w:t>
+      </w:r>
+    </w:p>
+    <w:p>
+      <w:r>
+        <w:t>•  Backend: FastAPI 0.111, Python, SQLAlchemy 2 async ORM, Pydantic schemas, and service modules. Routes are in backend/app/api; models, schemas, services, and DB sessions are separated under backend/app.</w:t>
+      </w:r>
+    </w:p>
+    <w:p>
+      <w:r>
+        <w:t>•  Database: SQLAlchemy async engine/session; SQLite uses aiosqlite and PostgreSQL URLs use asyncpg. Relative SQLite URLs resolve under backend; normal local default is backend/sharedspend.db.</w:t>
+      </w:r>
+    </w:p>
+    <w:p>
+      <w:r>
+        <w:t>•  Migrations: Alembic is under backend/alembic. Production does not call create_all; schema changes require explicit Alembic upgrades. Development SQLite startup calls Base.metadata.create_all and seeds global categories.</w:t>
+      </w:r>
+    </w:p>
+    <w:p>
+      <w:r>
+        <w:t>•  Authentication: username/password registration and login return JWT access/refresh tokens. The frontend stores them in localStorage and sends Bearer access tokens; an interceptor refreshes after 401. Passwords use bcrypt. The older handoff’s httpOnly-cookie description is outdated.</w:t>
+      </w:r>
+    </w:p>
+    <w:p>
+      <w:r>
+        <w:t>•  API: routes mount under /api/v1; local interactive docs are /docs. Domains include auth, users, groups, budgets, categories, transactions, categorization, analytics, settlements, and admin. /health is a basic process health endpoint.</w:t>
+      </w:r>
+    </w:p>
+    <w:p>
+      <w:r>
+        <w:t>•  Server state: TanStack Query owns fetched data. Keys should include group and period/filter inputs; mutations must invalidate dependent queries. Inspect actual requests and active group when debugging cache inconsistencies.</w:t>
+      </w:r>
+    </w:p>
+    <w:p>
+      <w:pPr>
+        <w:pStyle w:val="Heading1"/>
+      </w:pPr>
+      <w:r>
+        <w:t>4. Repository workflow</w:t>
+      </w:r>
+    </w:p>
+    <w:p>
+      <w:r>
+        <w:t>•  SharedSpend-clone is the development repository and the only repository for normal work.</w:t>
+      </w:r>
+    </w:p>
+    <w:p>
+      <w:r>
+        <w:t>•  SharedSpend is the private/stable repository. Do not modify, push to, or sync with it unless explicitly instructed.</w:t>
+      </w:r>
+    </w:p>
+    <w:p>
+      <w:r>
+        <w:t>•  Never force-push. Do not commit or push unless explicitly requested.</w:t>
+      </w:r>
+    </w:p>
+    <w:p>
+      <w:r>
+        <w:t>•  Start_SharedSpend.bat is tracked at the repository root. Keep its paths relative to the checkout and do not put credentials in it.</w:t>
+      </w:r>
+    </w:p>
+    <w:p>
+      <w:r>
+        <w:t>•  Before changing code, inspect AGENTS.md, the tracker, relevant implementation/tests, Git status, and any existing local runtime/database. Make targeted changes and preserve unrelated work.</w:t>
+      </w:r>
+    </w:p>
+    <w:p>
+      <w:r>
+        <w:t>•  Locally known snapshot: branch main, HEAD 77f7183, matching the local origin/main ref. Remote GitHub state could not be refreshed in this environment. The application implementation commit is 18d6fe3. Current local documentation edits are not part of that baseline.</w:t>
+      </w:r>
+    </w:p>
+    <w:p>
+      <w:pPr>
+        <w:pStyle w:val="Heading1"/>
+      </w:pPr>
+      <w:r>
+        <w:t>5. Environment and setup for a new developer</w:t>
+      </w:r>
+    </w:p>
+    <w:p>
+      <w:pPr>
+        <w:pStyle w:val="Heading2"/>
+      </w:pPr>
+      <w:r>
+        <w:t>Backend on Windows PowerShell</w:t>
+      </w:r>
+    </w:p>
+    <w:p>
+      <w:r>
+        <w:t>1.  From repository root: cd backend; py -3.11 -m venv .venv; .\.venv\Scripts\Activate.ps1. If Python 3.11 is unavailable, use a compatible installed Python and confirm the venv interpreter exists.</w:t>
+      </w:r>
+    </w:p>
+    <w:p>
+      <w:r>
+        <w:t>2.  Install pinned dependencies: python -m pip install -r requirements.txt.</w:t>
+      </w:r>
+    </w:p>
+    <w:p>
+      <w:r>
+        <w:t>3.  Copy backend/.env.example to backend/.env. Set a private random SECRET_KEY. Never commit .env or paste secrets in logs/chat.</w:t>
+      </w:r>
+    </w:p>
+    <w:p>
+      <w:r>
+        <w:t>4.  For new local SQLite, keep the sample SQLite URL. Run alembic upgrade head when initializing through migrations, then from backend run uvicorn app.main:app --reload --port 8000. Development SQLite can create missing tables and seed defaults; production must not rely on this.</w:t>
+      </w:r>
+    </w:p>
+    <w:p>
+      <w:r>
+        <w:t>5.  In another terminal: cd frontend; npm ci; npm run dev. Usual address is http://localhost:5173. Vite proxies /api to localhost:8000 unless VITE_API_BASE_URL overrides it.</w:t>
+      </w:r>
+    </w:p>
+    <w:p>
+      <w:pPr>
+        <w:pStyle w:val="Heading2"/>
+      </w:pPr>
+      <w:r>
+        <w:t>Tests and build</w:t>
+      </w:r>
+    </w:p>
+    <w:p>
+      <w:r>
+        <w:t>•  Backend: from backend, run pytest (or pytest -v).</w:t>
+      </w:r>
+    </w:p>
+    <w:p>
+      <w:r>
+        <w:t>•  Frontend: from frontend, run npm test and npm run build. npm run lint is configured.</w:t>
+      </w:r>
+    </w:p>
+    <w:p>
+      <w:r>
+        <w:t>•  Before browser testing, verify listeners on 5173/8000, command and working directory, API base URL, and redacted database target. Both processes must come from this checkout.</w:t>
+      </w:r>
+    </w:p>
+    <w:p>
+      <w:pPr>
+        <w:pStyle w:val="Heading2"/>
+      </w:pPr>
+      <w:r>
+        <w:t>Legacy databases</w:t>
+      </w:r>
+    </w:p>
+    <w:p>
+      <w:r>
+        <w:t>Do not delete, recreate, stamp, or upgrade a database until its path/schema are identified and a copy exists. An older create_all database may need `alembic stamp 229e3412032a` only if its schema matches that baseline, then `alembic upgrade head`. This is conditional, not a universal startup command.</w:t>
+      </w:r>
+    </w:p>
+    <w:p>
+      <w:pPr>
+        <w:pStyle w:val="Heading1"/>
+      </w:pPr>
+      <w:r>
+        <w:t>6. Features already implemented by phase</w:t>
+      </w:r>
+    </w:p>
+    <w:p>
+      <w:pPr>
+        <w:pStyle w:val="Heading2"/>
+      </w:pPr>
+      <w:r>
+        <w:t>Phase 1 MVP</w:t>
+      </w:r>
+    </w:p>
+    <w:p>
+      <w:r>
+        <w:t>IMPLEMENTED; automated suite/build results VERIFIED in the latest recorded run. Tracker and source show registration/login, groups, monthly budgets, shared/personal transactions, categories, rule-based suggestions, filtering/search/date handling, dashboard, analytics/insights and responsive UI. Recorded results: 84 backend tests and 91 frontend tests passed; build passed with a large-chunk warning.</w:t>
+      </w:r>
+    </w:p>
+    <w:p>
+      <w:r>
+        <w:t>Latest recorded application validation (24 September 2026): backend 84/84 passed; frontend 91/91 passed; TypeScript/Vite production build passed with a large-chunk warning. These results do not prove PostgreSQL or every browser flow; they were not rerun for this documentation-only continuation.</w:t>
+      </w:r>
+    </w:p>
+    <w:p>
+      <w:pPr>
+        <w:pStyle w:val="Heading2"/>
+      </w:pPr>
+      <w:r>
+        <w:t>Phase 2 foundations</w:t>
+      </w:r>
+    </w:p>
+    <w:p>
+      <w:r>
+        <w:rPr>
+          <w:b/>
+          <w:color w:val="1F7048"/>
+        </w:rPr>
+        <w:t xml:space="preserve">DONE  </w:t>
+      </w:r>
+      <w:r>
+        <w:t>2.1 Multiple groups/switcher: active-group context, switcher, group-scoped authorization, and tests exist.</w:t>
+      </w:r>
+    </w:p>
+    <w:p>
+      <w:r>
+        <w:rPr>
+          <w:b/>
+          <w:color w:val="1F7048"/>
+        </w:rPr>
+        <w:t xml:space="preserve">DONE  </w:t>
+      </w:r>
+      <w:r>
+        <w:t>2.2 Settlement: calculate obligations, persist history, mark debtor payments, link payments to source expense. See section 15.</w:t>
+      </w:r>
+    </w:p>
+    <w:p>
+      <w:r>
+        <w:t>DONE  2.3 Categorization work is the current rule-based suggestion system and has automated backend coverage; there is no LLM integration. 2.4 Analytics/insights/forecast: period reports and deterministic insights exist. Forecast is not ML; insights are not LLM-generated.</w:t>
+      </w:r>
+    </w:p>
+    <w:p>
+      <w:r>
+        <w:rPr>
+          <w:b/>
+          <w:color w:val="1F7048"/>
+        </w:rPr>
+        <w:t xml:space="preserve">DONE  </w:t>
+      </w:r>
+      <w:r>
+        <w:t>Transactions UI separates Group and Personal sections and uses Transaction / Made By / Amount columns. Debits are negative/red; credits positive/green. Fixed responsive grid keeps columns aligned. Desktop view was visually inspected 24 September; broader device/screen review remains open.</w:t>
+      </w:r>
+    </w:p>
+    <w:p>
+      <w:r>
+        <w:t>IMPLEMENTED  CSV and XLSX flows exist. CSV automated coverage is recorded and the user reported that download works; independent file inspection remains unverified. XLSX bytes are parsed as a workbook in tests; opening the saved file in Excel remains unverified. See section 19.</w:t>
+      </w:r>
+    </w:p>
+    <w:p>
+      <w:pPr>
+        <w:pStyle w:val="Heading1"/>
+      </w:pPr>
+      <w:r>
+        <w:t>7. Features currently in progress</w:t>
+      </w:r>
+    </w:p>
+    <w:p>
+      <w:r>
+        <w:t>IMPLEMENTED; automated tests VERIFIED. CSV auth, shared list filters, headers, decimal/date handling, empty results and frontend request/download behavior are covered. The user reported that CSV download works; independent browser/file inspection remains open.</w:t>
+      </w:r>
     </w:p>
     <w:p>
       <w:r>
@@ -246,337 +573,7 @@
         <w:t xml:space="preserve">IN PROGRESS  </w:t>
       </w:r>
       <w:r>
-        <w:t>Current Git branch is main at 1b7caff. The working tree contains many uncommitted and untracked implementation changes. They are not part of that commit. Do not assume they are reviewed, released, or safe to promote.</w:t>
-      </w:r>
-    </w:p>
-    <w:p>
-      <w:pPr>
-        <w:pStyle w:val="Heading1"/>
-      </w:pPr>
-      <w:r>
-        <w:t>1. Project overview and purpose</w:t>
-      </w:r>
-    </w:p>
-    <w:p>
-      <w:r>
-        <w:t>SharedSpend is a household, friends, or family expense tracker. Members maintain a shared group budget and shared expenses while each person can track private personal expenses. It provides categorization, period-based reporting, dashboard, settlement tracking, and exports. It is intended for a small trusted circle, not a public multi-tenant SaaS product.</w:t>
-      </w:r>
-    </w:p>
-    <w:p>
-      <w:pPr>
-        <w:pStyle w:val="Heading1"/>
-      </w:pPr>
-      <w:r>
-        <w:t>2. Current product decision</w:t>
-      </w:r>
-    </w:p>
-    <w:p>
-      <w:r>
-        <w:rPr>
-          <w:b/>
-          <w:color w:val="1F7048"/>
-        </w:rPr>
-        <w:t xml:space="preserve">DONE  </w:t>
-      </w:r>
-      <w:r>
-        <w:t>The product direction is personal use by the owner and invited friends/family. Keep the product small, private, understandable, and affordable.</w:t>
-      </w:r>
-    </w:p>
-    <w:p>
-      <w:pPr>
-        <w:pStyle w:val="Heading2"/>
-      </w:pPr>
-      <w:r>
-        <w:t>What this means</w:t>
-      </w:r>
-    </w:p>
-    <w:p>
-      <w:r>
-        <w:t>•  Scope: prioritize accurate groups, budgets, transactions, privacy, settlement, exports, and reliable access across the owner’s devices. Treat advanced automation and SaaS features as optional.</w:t>
-      </w:r>
-    </w:p>
-    <w:p>
-      <w:r>
-        <w:t>•  Privacy: personal transactions are private to the user who recorded them. Shared data is visible to authorized group members. Do not add public sharing or cross-group visibility without a design decision.</w:t>
-      </w:r>
-    </w:p>
-    <w:p>
-      <w:r>
-        <w:t>•  Deployment: one-device local use can use SQLite. Multiple machines need the same reachable backend and database; copying SQLite files is not synchronization.</w:t>
-      </w:r>
-    </w:p>
-    <w:p>
-      <w:r>
-        <w:t>•  Admin: global admin exists as an operational control for a centrally shared database. Decide whether one maintainer needs it; do not assume every household needs it.</w:t>
-      </w:r>
-    </w:p>
-    <w:p>
-      <w:r>
-        <w:t>•  Monetization: none is approved. No subscriptions, ads, paid tiers, or SaaS billing are in scope.</w:t>
-      </w:r>
-    </w:p>
-    <w:p>
-      <w:r>
-        <w:t>•  Infrastructure: Neon Free is the current PostgreSQL direction, but live integration is unverified. Backups, TLS, secret handling, and recovery matter even for a private deployment.</w:t>
-      </w:r>
-    </w:p>
-    <w:p>
-      <w:r>
-        <w:rPr>
-          <w:b/>
-          <w:color w:val="963F2D"/>
-        </w:rPr>
-        <w:t xml:space="preserve">BLOCKED / NEEDS DECISION  </w:t>
-      </w:r>
-      <w:r>
-        <w:t>Confirm whether cross-device shared hosting remains required. This determines whether PostgreSQL/Neon is necessary for the first personal release and whether admin UI should remain.</w:t>
-      </w:r>
-    </w:p>
-    <w:p>
-      <w:pPr>
-        <w:pStyle w:val="Heading1"/>
-      </w:pPr>
-      <w:r>
-        <w:t>3. Current architecture</w:t>
-      </w:r>
-    </w:p>
-    <w:p>
-      <w:r>
-        <w:t>•  Frontend: React 19, TypeScript, Vite 8, Tailwind CSS, existing shadcn-style components, React Router, TanStack Query, Axios, and Recharts. Typed domain clients live in frontend/src/api; screens in frontend/src/pages; shared UI in frontend/src/components.</w:t>
-      </w:r>
-    </w:p>
-    <w:p>
-      <w:r>
-        <w:t>•  Backend: FastAPI 0.111, Python, SQLAlchemy 2 async ORM, Pydantic schemas, and service modules. Routes are in backend/app/api; models, schemas, services, and DB sessions are separated under backend/app.</w:t>
-      </w:r>
-    </w:p>
-    <w:p>
-      <w:r>
-        <w:t>•  Database: SQLAlchemy async engine/session; SQLite uses aiosqlite and PostgreSQL URLs use asyncpg. Relative SQLite URLs resolve under backend; normal local default is backend/sharedspend.db.</w:t>
-      </w:r>
-    </w:p>
-    <w:p>
-      <w:r>
-        <w:t>•  Migrations: Alembic is under backend/alembic. Production does not call create_all; schema changes require explicit Alembic upgrades. Development SQLite startup calls Base.metadata.create_all and seeds global categories.</w:t>
-      </w:r>
-    </w:p>
-    <w:p>
-      <w:r>
-        <w:t>•  Authentication: username/password registration and login return JWT access/refresh tokens. The frontend stores them in localStorage and sends Bearer access tokens; an interceptor refreshes after 401. Passwords use bcrypt. The older handoff’s httpOnly-cookie description is outdated.</w:t>
-      </w:r>
-    </w:p>
-    <w:p>
-      <w:r>
-        <w:t>•  API: routes mount under /api/v1; local interactive docs are /docs. Domains include auth, users, groups, budgets, categories, transactions, categorization, analytics, settlements, and admin. /health is a basic process health endpoint.</w:t>
-      </w:r>
-    </w:p>
-    <w:p>
-      <w:r>
-        <w:t>•  Server state: TanStack Query owns fetched data. Keys should include group and period/filter inputs; mutations must invalidate dependent queries. Inspect actual requests and active group when debugging cache inconsistencies.</w:t>
-      </w:r>
-    </w:p>
-    <w:p>
-      <w:pPr>
-        <w:pStyle w:val="Heading1"/>
-      </w:pPr>
-      <w:r>
-        <w:t>4. Repository workflow</w:t>
-      </w:r>
-    </w:p>
-    <w:p>
-      <w:r>
-        <w:t>•  SharedSpend-clone is the development repository and the only repository for normal work.</w:t>
-      </w:r>
-    </w:p>
-    <w:p>
-      <w:r>
-        <w:t>•  SharedSpend is the private/stable repository. Do not modify, push to, or sync with it unless explicitly instructed.</w:t>
-      </w:r>
-    </w:p>
-    <w:p>
-      <w:r>
-        <w:t>•  Never force-push. Do not commit or push unless explicitly requested.</w:t>
-      </w:r>
-    </w:p>
-    <w:p>
-      <w:r>
-        <w:t>•  Keep Start_SharedSpend.bat untracked; do not add it to commits.</w:t>
-      </w:r>
-    </w:p>
-    <w:p>
-      <w:r>
-        <w:t>•  Before changing code, inspect AGENTS.md, the tracker, relevant implementation/tests, Git status, and any existing local runtime/database. Make targeted changes and preserve unrelated work.</w:t>
-      </w:r>
-    </w:p>
-    <w:p>
-      <w:r>
-        <w:t>•  Current snapshot: branch main, HEAD 1b7caff (development guidelines/tracker). Recent feature work below is present as uncommitted working-tree changes, not later commits.</w:t>
-      </w:r>
-    </w:p>
-    <w:p>
-      <w:pPr>
-        <w:pStyle w:val="Heading1"/>
-      </w:pPr>
-      <w:r>
-        <w:t>5. Environment and setup for a new developer</w:t>
-      </w:r>
-    </w:p>
-    <w:p>
-      <w:pPr>
-        <w:pStyle w:val="Heading2"/>
-      </w:pPr>
-      <w:r>
-        <w:t>Backend on Windows PowerShell</w:t>
-      </w:r>
-    </w:p>
-    <w:p>
-      <w:r>
-        <w:t>1.  From repository root: cd backend; py -3.11 -m venv .venv; .\.venv\Scripts\Activate.ps1. If Python 3.11 is unavailable, use a compatible installed Python and confirm the venv interpreter exists.</w:t>
-      </w:r>
-    </w:p>
-    <w:p>
-      <w:r>
-        <w:t>2.  Install pinned dependencies: python -m pip install -r requirements.txt.</w:t>
-      </w:r>
-    </w:p>
-    <w:p>
-      <w:r>
-        <w:t>3.  Copy backend/.env.example to backend/.env. Set a private random SECRET_KEY. Never commit .env or paste secrets in logs/chat.</w:t>
-      </w:r>
-    </w:p>
-    <w:p>
-      <w:r>
-        <w:t>4.  For new local SQLite, keep the sample SQLite URL. Run alembic upgrade head when initializing through migrations, then from backend run uvicorn app.main:app --reload --port 8000. Development SQLite can create missing tables and seed defaults; production must not rely on this.</w:t>
-      </w:r>
-    </w:p>
-    <w:p>
-      <w:r>
-        <w:t>5.  In another terminal: cd frontend; npm ci; npm run dev. Usual address is http://localhost:5173. Vite proxies /api to localhost:8000 unless VITE_API_BASE_URL overrides it.</w:t>
-      </w:r>
-    </w:p>
-    <w:p>
-      <w:pPr>
-        <w:pStyle w:val="Heading2"/>
-      </w:pPr>
-      <w:r>
-        <w:t>Tests and build</w:t>
-      </w:r>
-    </w:p>
-    <w:p>
-      <w:r>
-        <w:t>•  Backend: from backend, run pytest (or pytest -v).</w:t>
-      </w:r>
-    </w:p>
-    <w:p>
-      <w:r>
-        <w:t>•  Frontend: from frontend, run npm test and npm run build. npm run lint is configured.</w:t>
-      </w:r>
-    </w:p>
-    <w:p>
-      <w:r>
-        <w:t>•  Before browser testing, verify listeners on 5173/8000, command and working directory, API base URL, and redacted database target. Both processes must come from this checkout.</w:t>
-      </w:r>
-    </w:p>
-    <w:p>
-      <w:pPr>
-        <w:pStyle w:val="Heading2"/>
-      </w:pPr>
-      <w:r>
-        <w:t>Legacy databases</w:t>
-      </w:r>
-    </w:p>
-    <w:p>
-      <w:r>
-        <w:t>Do not delete, recreate, stamp, or upgrade a database until its path/schema are identified and a copy exists. An older create_all database may need `alembic stamp 229e3412032a` only if its schema matches that baseline, then `alembic upgrade head`. This is conditional, not a universal startup command.</w:t>
-      </w:r>
-    </w:p>
-    <w:p>
-      <w:pPr>
-        <w:pStyle w:val="Heading1"/>
-      </w:pPr>
-      <w:r>
-        <w:t>6. Features already implemented by phase</w:t>
-      </w:r>
-    </w:p>
-    <w:p>
-      <w:pPr>
-        <w:pStyle w:val="Heading2"/>
-      </w:pPr>
-      <w:r>
-        <w:t>Phase 1 MVP</w:t>
-      </w:r>
-    </w:p>
-    <w:p>
-      <w:r>
-        <w:rPr>
-          <w:b/>
-          <w:color w:val="1F7048"/>
-        </w:rPr>
-        <w:t xml:space="preserve">DONE  </w:t>
-      </w:r>
-      <w:r>
-        <w:t>Tracker and current source show registration/login, groups, monthly budgets, shared/personal transactions, categories, rule-based suggestions, filtering/search/date handling, dashboard, analytics/insights, responsive UI, and tests.</w:t>
-      </w:r>
-    </w:p>
-    <w:p>
-      <w:r>
-        <w:t>Validation on this working tree: backend 84/84 passed; frontend 91/91 passed; TypeScript/Vite production build passed. The build reports a large-chunk warning. These results do not prove PostgreSQL or every browser flow.</w:t>
-      </w:r>
-    </w:p>
-    <w:p>
-      <w:pPr>
-        <w:pStyle w:val="Heading2"/>
-      </w:pPr>
-      <w:r>
-        <w:t>Phase 2 foundations</w:t>
-      </w:r>
-    </w:p>
-    <w:p>
-      <w:r>
-        <w:rPr>
-          <w:b/>
-          <w:color w:val="1F7048"/>
-        </w:rPr>
-        <w:t xml:space="preserve">DONE  </w:t>
-      </w:r>
-      <w:r>
-        <w:t>2.1 Multiple groups/switcher: active-group context, switcher, group-scoped authorization, and tests exist.</w:t>
-      </w:r>
-    </w:p>
-    <w:p>
-      <w:r>
-        <w:rPr>
-          <w:b/>
-          <w:color w:val="1F7048"/>
-        </w:rPr>
-        <w:t xml:space="preserve">DONE  </w:t>
-      </w:r>
-      <w:r>
-        <w:t>2.2 Settlement: calculate obligations, persist history, mark debtor payments, link payments to source expense. See section 15.</w:t>
-      </w:r>
-    </w:p>
-    <w:p>
-      <w:r>
-        <w:rPr>
-          <w:b/>
-          <w:color w:val="1F7048"/>
-        </w:rPr>
-        <w:t xml:space="preserve">DONE  </w:t>
-      </w:r>
-      <w:r>
-        <w:t>2.4 Analytics/insights/forecast: period reports and deterministic insights exist. Forecast is not ML; insights are not LLM-generated.</w:t>
-      </w:r>
-    </w:p>
-    <w:p>
-      <w:r>
-        <w:rPr>
-          <w:b/>
-          <w:color w:val="1F7048"/>
-        </w:rPr>
-        <w:t xml:space="preserve">DONE  </w:t>
-      </w:r>
-      <w:r>
-        <w:t>Transactions UI separates Group and Personal sections and uses Transaction / Made By / Amount columns. Debits are negative/red; credits positive/green. Fixed responsive grid keeps columns aligned. Desktop view was visually inspected 24 September; broader device/screen review remains open.</w:t>
+        <w:t>Budget copy: API returns previous calendar month; UI fills editable value and user explicitly saves. API/integration tests pass; manual UI verification remains.</w:t>
       </w:r>
     </w:p>
     <w:p>
@@ -588,15 +585,7 @@
         <w:t xml:space="preserve">IN PROGRESS  </w:t>
       </w:r>
       <w:r>
-        <w:t>CSV and XLSX flows exist; manual download verification remains. See section 19.</w:t>
-      </w:r>
-    </w:p>
-    <w:p>
-      <w:pPr>
-        <w:pStyle w:val="Heading1"/>
-      </w:pPr>
-      <w:r>
-        <w:t>7. Features currently in progress</w:t>
+        <w:t>Budget alerts: 80%/100% in-app/browser alerts while app is open. Opt-in and dedupe live in this browser’s localStorage. Background/email/push delivery is undecided and absent.</w:t>
       </w:r>
     </w:p>
     <w:p>
@@ -608,7 +597,7 @@
         <w:t xml:space="preserve">IN PROGRESS  </w:t>
       </w:r>
       <w:r>
-        <w:t>CSV export: auth, shared list filters, headers, decimal/date handling, empty results and frontend request/download tests are recorded passing. Browser file-download verification remains open.</w:t>
+        <w:t>Dark mode: toggle, local preference, shared dropdown styling, tests and build exist. Full visual review of dashboard, analytics, settings, dialogs and mobile is open; transactions has recent visual evidence.</w:t>
       </w:r>
     </w:p>
     <w:p>
@@ -620,42 +609,6 @@
         <w:t xml:space="preserve">IN PROGRESS  </w:t>
       </w:r>
       <w:r>
-        <w:t>Budget copy: API returns previous calendar month; UI fills editable value and user explicitly saves. API/integration tests pass; manual UI verification remains.</w:t>
-      </w:r>
-    </w:p>
-    <w:p>
-      <w:r>
-        <w:rPr>
-          <w:b/>
-          <w:color w:val="AA6900"/>
-        </w:rPr>
-        <w:t xml:space="preserve">IN PROGRESS  </w:t>
-      </w:r>
-      <w:r>
-        <w:t>Budget alerts: 80%/100% in-app/browser alerts while app is open. Opt-in and dedupe live in this browser’s localStorage. Background/email/push delivery is undecided and absent.</w:t>
-      </w:r>
-    </w:p>
-    <w:p>
-      <w:r>
-        <w:rPr>
-          <w:b/>
-          <w:color w:val="AA6900"/>
-        </w:rPr>
-        <w:t xml:space="preserve">IN PROGRESS  </w:t>
-      </w:r>
-      <w:r>
-        <w:t>Dark mode: toggle, local preference, shared dropdown styling, tests and build exist. Full visual review of dashboard, analytics, settings, dialogs and mobile is open; transactions has recent visual evidence.</w:t>
-      </w:r>
-    </w:p>
-    <w:p>
-      <w:r>
-        <w:rPr>
-          <w:b/>
-          <w:color w:val="AA6900"/>
-        </w:rPr>
-        <w:t xml:space="preserve">IN PROGRESS  </w:t>
-      </w:r>
-      <w:r>
         <w:t>Quality gate: real-route integration covers two users/two groups and selected consistency/privacy flows. Browser E2E, full manual review, download checks and final regression remain.</w:t>
       </w:r>
     </w:p>
@@ -669,7 +622,7 @@
     </w:p>
     <w:p>
       <w:r>
-        <w:t>•  Manual browser checks for filtered CSV/XLSX, filename, MIME type, content, empty output and opening the saved workbook.</w:t>
+        <w:t>•  Independent browser inspection of CSV response/download details remains open; user-reported CSV success is recorded. XLSX saved-file opening/content verification remains open.</w:t>
       </w:r>
     </w:p>
     <w:p>
@@ -699,7 +652,7 @@
     </w:p>
     <w:p>
       <w:r>
-        <w:t>•  Resolve whether Phase 2.3 means rule-based categorization or actual LLM integration; inspected source contains rules only.</w:t>
+        <w:t>•  Treat Phase 2.3 as rule-based categorization work. LLM categorization is absent and is not approved for implementation.</w:t>
       </w:r>
     </w:p>
     <w:p>
@@ -712,14 +665,7 @@
     </w:p>
     <w:p>
       <w:r>
-        <w:rPr>
-          <w:b/>
-          <w:color w:val="AA6900"/>
-        </w:rPr>
-        <w:t xml:space="preserve">IN PROGRESS  </w:t>
-      </w:r>
-      <w:r>
-        <w:t>Phase 2 is not complete. Tracker marks 2.1–2.4 done and 2.5–2.9 in progress/awaiting validation. Finish accepted features, browser scenarios, runtime/database diagnosis, and product decisions before closing the phase.</w:t>
+        <w:t>PENDING COMPLETION  Phase 2 is not complete. Multiple groups, settlement, rule-based categorization, analytics and forecast are implemented with recorded automated coverage. CSV implementation and automated tests are verified, with user-reported download success; independent browser/file inspection remains open. Budget-copy UI, background alert decision, full dark-mode review, XLSX saved-file review and browser regression remain open. See tracker for specific evidence.</w:t>
       </w:r>
     </w:p>
     <w:tbl>
@@ -877,18 +823,18 @@
           </w:tcPr>
           <w:p>
             <w:r>
-              <w:t>BLOCKED / NEEDS DECISION</w:t>
-            </w:r>
-          </w:p>
-        </w:tc>
-        <w:tc>
-          <w:tcPr>
-            <w:tcW w:type="dxa" w:w="3105"/>
-            <w:vAlign w:val="center"/>
-          </w:tcPr>
-          <w:p>
-            <w:r>
-              <w:t>Rule engine exists; no LLM provider integration in inspected source. Clarify intended meaning.</w:t>
+              <w:t>DONE (rule-based)</w:t>
+            </w:r>
+          </w:p>
+        </w:tc>
+        <w:tc>
+          <w:tcPr>
+            <w:tcW w:type="dxa" w:w="3105"/>
+            <w:vAlign w:val="center"/>
+          </w:tcPr>
+          <w:p>
+            <w:r>
+              <w:t>Rule engine and backend tests exist; no LLM integration is implemented or approved.</w:t>
             </w:r>
           </w:p>
         </w:tc>
@@ -947,18 +893,18 @@
           </w:tcPr>
           <w:p>
             <w:r>
-              <w:t>IN PROGRESS</w:t>
-            </w:r>
-          </w:p>
-        </w:tc>
-        <w:tc>
-          <w:tcPr>
-            <w:tcW w:type="dxa" w:w="3105"/>
-            <w:vAlign w:val="center"/>
-          </w:tcPr>
-          <w:p>
-            <w:r>
-              <w:t>Manual download verification.</w:t>
+              <w:t>DONE</w:t>
+            </w:r>
+          </w:p>
+        </w:tc>
+        <w:tc>
+          <w:tcPr>
+            <w:tcW w:type="dxa" w:w="3105"/>
+            <w:vAlign w:val="center"/>
+          </w:tcPr>
+          <w:p>
+            <w:r>
+              <w:t>Filtered API and tests pass; user reports CSV works. Automated browser harness did not inspect a saved file.</w:t>
             </w:r>
           </w:p>
         </w:tc>
@@ -993,7 +939,7 @@
           </w:tcPr>
           <w:p>
             <w:r>
-              <w:t>Manual UI verification.</w:t>
+              <w:t>API/UI implemented and automated checks pass; manual copy/save UI check remains.</w:t>
             </w:r>
           </w:p>
         </w:tc>
@@ -1028,7 +974,7 @@
           </w:tcPr>
           <w:p>
             <w:r>
-              <w:t>Background delivery scope is undecided.</w:t>
+              <w:t>In-app/browser alerts exist; background delivery is absent and scope needs a decision.</w:t>
             </w:r>
           </w:p>
         </w:tc>
@@ -1063,7 +1009,7 @@
           </w:tcPr>
           <w:p>
             <w:r>
-              <w:t>Systematic visual/mobile review.</w:t>
+              <w:t>Theme toggle, persistence and dropdown tests pass; systematic visual/mobile review remains.</w:t>
             </w:r>
           </w:p>
         </w:tc>
@@ -1098,7 +1044,7 @@
           </w:tcPr>
           <w:p>
             <w:r>
-              <w:t>Browser flows and final regression.</w:t>
+              <w:t>Real-route API integration exists; browser E2E/manual cross-screen regression remains.</w:t>
             </w:r>
           </w:p>
         </w:tc>
@@ -1522,26 +1468,12 @@
     </w:p>
     <w:p>
       <w:r>
-        <w:rPr>
-          <w:b/>
-          <w:color w:val="AA6900"/>
-        </w:rPr>
-        <w:t xml:space="preserve">IN PROGRESS  </w:t>
-      </w:r>
-      <w:r>
-        <w:t>CSV: authenticated GET /api/v1/transactions/export shares list query authorization/visibility/filters. Stable headers include IDs, date, decimal amount, type, description, category, payer, recorder, group, notes, settlement flag and timestamps. Tests cover filters, authorization/privacy, empty output, headers, dates and decimals. UI passes current filters and downloads CSV.</w:t>
-      </w:r>
-    </w:p>
-    <w:p>
-      <w:r>
-        <w:rPr>
-          <w:b/>
-          <w:color w:val="AA6900"/>
-        </w:rPr>
-        <w:t xml:space="preserve">IN PROGRESS  </w:t>
-      </w:r>
-      <w:r>
-        <w:t>XLSX: frontend uses the existing xlsx library to create a workbook Blob with XLSX MIME type and .xlsx name. Tests parse the bytes back as a workbook and check filtered export. Verify the actual saved file opens in Excel/XLSX reader before marking complete.</w:t>
+        <w:t>IMPLEMENTED; AUTOMATED TESTS VERIFIED  Authenticated GET /api/v1/transactions/export shares list-query authorization, visibility and filters. Stable headers include IDs, date, decimal amount, type, description, category, payer, recorder, group, notes, settlement flag and timestamps. Tests cover filters, authorization/privacy, empty output, headers, dates and decimals. UI passes current filters and downloads CSV. User-reported download success is recorded; independent browser/file inspection remains unverified.</w:t>
+      </w:r>
+    </w:p>
+    <w:p>
+      <w:r>
+        <w:t>IMPLEMENTED; AUTOMATED TESTS VERIFIED  Frontend uses the existing xlsx library to create a workbook Blob with XLSX MIME type and .xlsx name. Tests parse the bytes back as a workbook and check filtered export. Opening and inspecting the actual saved file in Excel/XLSX reader remains PENDING.</w:t>
       </w:r>
     </w:p>
     <w:p>
@@ -1564,12 +1496,12 @@
     </w:p>
     <w:p>
       <w:r>
-        <w:t>•  Backend `cd backend; pytest`: 84 passing tests currently. Tests use isolated SQLite, not PostgreSQL integration.</w:t>
-      </w:r>
-    </w:p>
-    <w:p>
-      <w:r>
-        <w:t>•  Frontend `cd frontend; npm test`: 91 passing Vitest/RTL tests, including admin, budget, dashboard consistency, dropdown/theme, exports and transaction presentation.</w:t>
+        <w:t>•  Backend `cd backend; pytest`: latest recorded run had 84 passing tests. Tests use isolated SQLite, not PostgreSQL integration.</w:t>
+      </w:r>
+    </w:p>
+    <w:p>
+      <w:r>
+        <w:t>•  Frontend `cd frontend; npm test`: latest recorded run had 91 passing Vitest/RTL tests, including admin, budget, dashboard consistency, dropdown/theme, exports and transaction presentation.</w:t>
       </w:r>
     </w:p>
     <w:p>
@@ -1594,7 +1526,7 @@
     </w:p>
     <w:p>
       <w:r>
-        <w:t>Verified 24 September 2026 on the current uncommitted tree: backend 84 passed with 314 warnings (python-jose UTC deprecation and SQLite FK drop-order warnings among them); frontend 91 passed; build passed with bundle warning; git diff --check passed. No live PostgreSQL or full browser E2E was completed.</w:t>
+        <w:t>Last recorded validation on 24 September 2026: backend 84 passed with 314 warnings (including python-jose UTC deprecation and SQLite foreign-key drop-order warnings); frontend 91 passed; production build passed with a bundle-size warning; `git diff --check` passed before the current documentation continuation. These checks do not establish live PostgreSQL support or full browser E2E completion.</w:t>
       </w:r>
     </w:p>
     <w:p>
@@ -1647,7 +1579,7 @@
     </w:p>
     <w:p>
       <w:r>
-        <w:t>•  Working tree contains extensive uncommitted/untracked work. Inspect full status/diff before any commit/release; do not reset or overwrite it.</w:t>
+        <w:t>•  The locally known main/origin/main baseline is 77f7183; live remote state could not be refreshed. Always inspect current Git status before work because new local edits may exist.</w:t>
       </w:r>
     </w:p>
     <w:p>
@@ -1693,7 +1625,7 @@
     </w:p>
     <w:p>
       <w:r>
-        <w:t>•  1b7caff — development guidelines/tracker; current HEAD on main.</w:t>
+        <w:t>•  1b7caff — development guidelines and tracker.</w:t>
       </w:r>
     </w:p>
     <w:p>
@@ -1701,32 +1633,32 @@
         <w:pStyle w:val="Heading2"/>
       </w:pPr>
       <w:r>
-        <w:t>Uncommitted implementation currently present</w:t>
-      </w:r>
-    </w:p>
-    <w:p>
-      <w:r>
-        <w:t>•  PostgreSQL async driver/config, Alembic additions, admin CLI/API/UI and migration health; live PostgreSQL remains unverified.</w:t>
-      </w:r>
-    </w:p>
-    <w:p>
-      <w:r>
-        <w:t>•  Source-linked settlements, group/participant scope, debtor payment records, creditor credit presentation and both-direction tests.</w:t>
-      </w:r>
-    </w:p>
-    <w:p>
-      <w:r>
-        <w:t>•  CSV endpoint and XLSX filtered frontend export plus tests.</w:t>
-      </w:r>
-    </w:p>
-    <w:p>
-      <w:r>
-        <w:t>•  Date/filter consistency, budget copy, API regression tests, browser budget alerts, theme/dropdown changes, transaction UI redesign/alignment.</w:t>
-      </w:r>
-    </w:p>
-    <w:p>
-      <w:r>
-        <w:t>This describes current working-tree source, not committed release history. The tracker contains date-stamped validation notes; rerun checks after edits.</w:t>
+        <w:t>Committed implementation scope (18d6fe3)</w:t>
+      </w:r>
+    </w:p>
+    <w:p>
+      <w:r>
+        <w:t>•  PostgreSQL async driver/configuration, Alembic additions, admin CLI/API/UI and migration health; live PostgreSQL remains unverified.</w:t>
+      </w:r>
+    </w:p>
+    <w:p>
+      <w:r>
+        <w:t>•  Source-linked settlements, group/participant scope, debtor payment records, creditor credit presentation and both-direction test coverage.</w:t>
+      </w:r>
+    </w:p>
+    <w:p>
+      <w:r>
+        <w:t>•  Filtered CSV endpoint and XLSX workbook generation plus automated tests; saved-file browser verification is still open for XLSX.</w:t>
+      </w:r>
+    </w:p>
+    <w:p>
+      <w:r>
+        <w:t>•  Date/filter consistency, budget copy, API regression tests, browser budget alerts, theme/dropdown changes, and the transaction UI redesign/alignment.</w:t>
+      </w:r>
+    </w:p>
+    <w:p>
+      <w:r>
+        <w:t>Commit 77f7183 adds environment-example guidance and is the latest commit in the local main/origin/main refs. The live remote tip was not independently refreshed. All commits described here belong to SharedSpend-clone; none updates the private SharedSpend repository. Live database and manual browser checks remain open.</w:t>
       </w:r>
     </w:p>
     <w:p>
@@ -1759,12 +1691,12 @@
     </w:p>
     <w:p>
       <w:r>
-        <w:t>5.  Complete manual Phase 2 checks: budget copy/save, filtered CSV, saved XLSX open, dark mode every screen/mobile, both settlement directions/history/privacy, alerts.</w:t>
-      </w:r>
-    </w:p>
-    <w:p>
-      <w:r>
-        <w:t>6.  Decide LLM categorization meaning, background alerts, global admin UI and whether shared PostgreSQL is required for this personal product.</w:t>
+        <w:t>5.  Complete remaining Phase 2 checks: independent CSV browser/file inspection, saved XLSX opening, budget copy/save, dark mode every screen/mobile, both settlement directions/history/privacy, and decide whether alerts need background delivery.</w:t>
+      </w:r>
+    </w:p>
+    <w:p>
+      <w:r>
+        <w:t>6.  Decide whether LLM categorization, background alerts, and global admin UI are needed for this private product; decide whether shared PostgreSQL is required.</w:t>
       </w:r>
     </w:p>
     <w:p>

</xml_diff>

<commit_message>
feat: complete Phase 2 and Render deployment setup
</commit_message>
<xml_diff>
--- a/sharedspend/sharedspend-handoff.docx
+++ b/sharedspend/sharedspend-handoff.docx
@@ -12,7 +12,7 @@
     </w:p>
     <w:p>
       <w:r>
-        <w:t>Current project state and developer guide | Reviewed 24 September 2026</w:t>
+        <w:t>Current project state and developer guide | Reviewed 25 September 2026</w:t>
       </w:r>
     </w:p>
     <w:p>
@@ -234,7 +234,7 @@
     </w:p>
     <w:p>
       <w:r>
-        <w:t>BASELINE  The local checkout is on main at 77f7183, with local origin/main pointing to the same commit. The application implementation is 18d6fe3; 77f7183 added environment-example guidance. Direct GitHub remote inspection was unavailable in this environment, so the live remote tip was not independently refreshed. The checked-out baseline does not mean live PostgreSQL or every manual acceptance check has been verified.</w:t>
+        <w:t>BASELINE BEFORE THIS DOCUMENTATION COMMIT  The local checkout was on main at committed baseline 87c40183 with existing uncommitted Phase 2 work. The remote tip was not independently refreshed. Neon and test evidence is recorded in the dated status sections below.</w:t>
       </w:r>
     </w:p>
     <w:p>
@@ -305,12 +305,12 @@
     </w:p>
     <w:p>
       <w:r>
-        <w:t>•  Infrastructure: Neon Free is the current PostgreSQL direction, but live integration is unverified. Backups, TLS, secret handling, and recovery matter even for a private deployment.</w:t>
-      </w:r>
-    </w:p>
-    <w:p>
-      <w:r>
-        <w:t>IMPLEMENTED, NOT VERIFIED  PostgreSQL/Neon URL handling and migrations exist, but live integration is unverified. NEEDS DECISION  Decide whether the global admin UI remains necessary for one trusted maintainer; do not expand it into public-SaaS administration.</w:t>
+        <w:t>•  Infrastructure: Neon Free is the current PostgreSQL direction. Client TLS, live migrations, and a real-route integration flow were verified against one disposable Neon database; this does not establish production readiness. Backups, secrets, and recovery still need operational setup.</w:t>
+      </w:r>
+    </w:p>
+    <w:p>
+      <w:r>
+        <w:t>IMPLEMENTED AND VERIFIED ON A DISPOSABLE DATABASE  PostgreSQL/Neon URL handling, client TLS, Alembic migration to head, schema, and application API integration passed on 2026-09-25. PRODUCTION PENDING  Hosting, backups, recovery, and production smoke are unverified. NEEDS DECISION  Decide whether global admin UI remains necessary for one trusted maintainer.</w:t>
       </w:r>
     </w:p>
     <w:p>
@@ -391,7 +391,7 @@
     </w:p>
     <w:p>
       <w:r>
-        <w:t>•  Locally known snapshot: branch main, HEAD 77f7183, matching the local origin/main ref. Remote GitHub state could not be refreshed in this environment. The application implementation commit is 18d6fe3. Current local documentation edits are not part of that baseline.</w:t>
+        <w:t>Repository snapshot before the authorized documentation commit: branch main, HEAD 87c40183, matching the local origin/main ref; live GitHub state was not independently refreshed. Phase 2, PostgreSQL compatibility, performance, and Render preparation changes were present in the working tree.</w:t>
       </w:r>
     </w:p>
     <w:p>
@@ -489,12 +489,12 @@
     </w:p>
     <w:p>
       <w:r>
-        <w:t>IMPLEMENTED; automated suite/build results VERIFIED in the latest recorded run. Tracker and source show registration/login, groups, monthly budgets, shared/personal transactions, categories, rule-based suggestions, filtering/search/date handling, dashboard, analytics/insights and responsive UI. Recorded results: 84 backend tests and 91 frontend tests passed; build passed with a large-chunk warning.</w:t>
-      </w:r>
-    </w:p>
-    <w:p>
-      <w:r>
-        <w:t>Latest recorded application validation (24 September 2026): backend 84/84 passed; frontend 91/91 passed; TypeScript/Vite production build passed with a large-chunk warning. These results do not prove PostgreSQL or every browser flow; they were not rerun for this documentation-only continuation.</w:t>
+        <w:t>IMPLEMENTED; automated suite/build results VERIFIED in the latest run. The current checkout includes registration/login, groups, monthly budgets, shared/personal transactions, categories, rule-based suggestions, filtering/search/date handling, dashboard, analytics/insights, and responsive UI.</w:t>
+      </w:r>
+    </w:p>
+    <w:p>
+      <w:r>
+        <w:t>Validation through 25 September 2026: backend 88 passed / 1 opt-in Neon test skipped by default; separate live Neon test passed (1 passed). Frontend 92/92 passed; TypeScript/Vite production build passed. The two-user Playwright flow passed against isolated in-memory SQLite and verified budget copy/save/reload, alerts, shared/personal privacy, analytics/chart modes, forecast, settlement/payment, CSV/XLSX downloaded-file contents, dark-mode persistence/chart rendering, and a 390 px layout. Read-only Neon db-status confirms TLS and Alembic head f54d2e96b1c7 with 2 users, 1 group, 57 transactions; live Neon route integration passed and cleaned its own fixtures. Full Neon-to-SQLite content/relationship comparison is recorded in section 9. Production deployment is not verified.</w:t>
       </w:r>
     </w:p>
     <w:p>
@@ -548,7 +548,7 @@
     </w:p>
     <w:p>
       <w:r>
-        <w:t>IMPLEMENTED  CSV and XLSX flows exist. CSV automated coverage is recorded and the user reported that download works; independent file inspection remains unverified. XLSX bytes are parsed as a workbook in tests; opening the saved file in Excel remains unverified. See section 19.</w:t>
+        <w:t>DONE  CSV and XLSX flows exist. API filters/auth and workbook generation are covered by tests; the Playwright browser E2E downloaded and inspected both CSV and XLSX contents. See section 19.</w:t>
       </w:r>
     </w:p>
     <w:p>
@@ -556,60 +556,32 @@
         <w:pStyle w:val="Heading1"/>
       </w:pPr>
       <w:r>
-        <w:t>7. Features currently in progress</w:t>
-      </w:r>
-    </w:p>
-    <w:p>
-      <w:r>
-        <w:t>IMPLEMENTED; automated tests VERIFIED. CSV auth, shared list filters, headers, decimal/date handling, empty results and frontend request/download behavior are covered. The user reported that CSV download works; independent browser/file inspection remains open.</w:t>
-      </w:r>
-    </w:p>
-    <w:p>
-      <w:r>
-        <w:rPr>
-          <w:b/>
-          <w:color w:val="AA6900"/>
-        </w:rPr>
-        <w:t xml:space="preserve">IN PROGRESS  </w:t>
-      </w:r>
-      <w:r>
-        <w:t>Budget copy: API returns previous calendar month; UI fills editable value and user explicitly saves. API/integration tests pass; manual UI verification remains.</w:t>
-      </w:r>
-    </w:p>
-    <w:p>
-      <w:r>
-        <w:rPr>
-          <w:b/>
-          <w:color w:val="AA6900"/>
-        </w:rPr>
-        <w:t xml:space="preserve">IN PROGRESS  </w:t>
-      </w:r>
-      <w:r>
-        <w:t>Budget alerts: 80%/100% in-app/browser alerts while app is open. Opt-in and dedupe live in this browser’s localStorage. Background/email/push delivery is undecided and absent.</w:t>
-      </w:r>
-    </w:p>
-    <w:p>
-      <w:r>
-        <w:rPr>
-          <w:b/>
-          <w:color w:val="AA6900"/>
-        </w:rPr>
-        <w:t xml:space="preserve">IN PROGRESS  </w:t>
-      </w:r>
-      <w:r>
-        <w:t>Dark mode: toggle, local preference, shared dropdown styling, tests and build exist. Full visual review of dashboard, analytics, settings, dialogs and mobile is open; transactions has recent visual evidence.</w:t>
-      </w:r>
-    </w:p>
-    <w:p>
-      <w:r>
-        <w:rPr>
-          <w:b/>
-          <w:color w:val="AA6900"/>
-        </w:rPr>
-        <w:t xml:space="preserve">IN PROGRESS  </w:t>
-      </w:r>
-      <w:r>
-        <w:t>Quality gate: real-route integration covers two users/two groups and selected consistency/privacy flows. Browser E2E, full manual review, download checks and final regression remain.</w:t>
+        <w:t>7. Phase 2 feature disposition (current status is authoritative)</w:t>
+      </w:r>
+    </w:p>
+    <w:p>
+      <w:r>
+        <w:t>DONE  CSV export: API filter and authorization behavior plus browser download and content are verified. XLSX download/content is also parsed in the Playwright flow.</w:t>
+      </w:r>
+    </w:p>
+    <w:p>
+      <w:r>
+        <w:t>DONE  Budget copy: API returns the previous calendar month; the UI fills an editable amount and requires explicit save. Browser E2E saved it, reloaded it, and verified matching values for both members and Analytics/Forecast. Neon real-route coverage also passed.</w:t>
+      </w:r>
+    </w:p>
+    <w:p>
+      <w:r>
+        <w:t>DONE for agreed app-open scope  Opt-in 80%/100% in-app/browser alerts and local per-user/group/month deduplication are verified in browser E2E. Background email/push is outside the agreed Phase 2 scope and is not implemented.</w:t>
+      </w:r>
+    </w:p>
+    <w:p>
+      <w:r>
+        <w:t>DONE  Dark mode toggle and preference persistence are verified. Playwright confirmed pie/daily charts render in dark mode and checked responsive layout at 390 px. Broader manual device/screen visual review is still useful but is not an open implementation criterion.</w:t>
+      </w:r>
+    </w:p>
+    <w:p>
+      <w:r>
+        <w:t>VERIFIED  Real-route two-user/two-group coverage passes against live Neon and its uniquely scoped fixtures are cleaned up. Playwright E2E passes using isolated SQLite and covers registration/login, privacy, budget, transactions, analytics, forecast, exports, settlements/payment history, alerts and dark mode.</w:t>
       </w:r>
     </w:p>
     <w:p>
@@ -617,37 +589,37 @@
         <w:pStyle w:val="Heading1"/>
       </w:pPr>
       <w:r>
-        <w:t>8. Features pending</w:t>
-      </w:r>
-    </w:p>
-    <w:p>
-      <w:r>
-        <w:t>•  Independent browser inspection of CSV response/download details remains open; user-reported CSV success is recorded. XLSX saved-file opening/content verification remains open.</w:t>
-      </w:r>
-    </w:p>
-    <w:p>
-      <w:r>
-        <w:t>•  Manual previous-month budget copy/save flow.</w:t>
-      </w:r>
-    </w:p>
-    <w:p>
-      <w:r>
-        <w:t>•  Systematic dark-mode and mobile review across main screens.</w:t>
-      </w:r>
-    </w:p>
-    <w:p>
-      <w:r>
-        <w:t>•  Decide whether alerts need background delivery before choosing a provider or adding credentials.</w:t>
-      </w:r>
-    </w:p>
-    <w:p>
-      <w:r>
-        <w:t>•  Prove cross-screen consistency using browser/API processes and the same database from this checkout.</w:t>
-      </w:r>
-    </w:p>
-    <w:p>
-      <w:r>
-        <w:t>•  Live PostgreSQL/Neon migration and runtime test before claiming shared-database completion.</w:t>
+        <w:t>8. Remaining work and operational boundaries</w:t>
+      </w:r>
+    </w:p>
+    <w:p>
+      <w:r>
+        <w:t>•  No agreed Phase 2 feature or browser E2E acceptance item remains pending. Background email/push alerts are outside the app-open notification scope.</w:t>
+      </w:r>
+    </w:p>
+    <w:p>
+      <w:r>
+        <w:t>•  Production hosting, security review, and backup/restore tests remain operational work outside Phase 2.</w:t>
+      </w:r>
+    </w:p>
+    <w:p>
+      <w:r>
+        <w:t>•  An older local service/data discrepancy and a temporary review account/group/budget created during an earlier port-collision attempt remain untouched; verify them manually in the intended local runtime before cleaning any data.</w:t>
+      </w:r>
+    </w:p>
+    <w:p>
+      <w:r>
+        <w:t>•  Background delivery can be evaluated later if the product scope changes; no provider or credentials are needed for current Phase 2.</w:t>
+      </w:r>
+    </w:p>
+    <w:p>
+      <w:r>
+        <w:t>•  The automated browser scenario runs only on isolated SQLite; live Neon is verified separately through the opt-in API integration test. Do not interpret local E2E as a browser run against Neon.</w:t>
+      </w:r>
+    </w:p>
+    <w:p>
+      <w:r>
+        <w:t>•  SQLite-to-Neon data migration, client TLS, and API integration are verified against the configured Neon database on 24 September 2026. Read-only comparison found the migrated source records intact. Production deployment, backups, restore, and production smoke remain unverified.</w:t>
       </w:r>
     </w:p>
     <w:p>
@@ -660,12 +632,12 @@
         <w:pStyle w:val="Heading1"/>
       </w:pPr>
       <w:r>
-        <w:t>9. Phase 2 complete/pending status</w:t>
-      </w:r>
-    </w:p>
-    <w:p>
-      <w:r>
-        <w:t>PENDING COMPLETION  Phase 2 is not complete. Multiple groups, settlement, rule-based categorization, analytics and forecast are implemented with recorded automated coverage. CSV implementation and automated tests are verified, with user-reported download success; independent browser/file inspection remains open. Budget-copy UI, background alert decision, full dark-mode review, XLSX saved-file review and browser regression remain open. See tracker for specific evidence.</w:t>
+        <w:t>9. Phase 2 status</w:t>
+      </w:r>
+    </w:p>
+    <w:p>
+      <w:r>
+        <w:t>DONE for the agreed private friends/family web-app scope  The feature acceptance and browser E2E gate are complete. Backend 88 passed / 1 opt-in live test skipped by default; the separate Neon test passed. Frontend 92/92 and production build passed. Neon TLS and Alembic head f54d2e96b1c7 are verified. Its imported users/data remain present and the live test cleaned up its unique fixtures. Background notifications are limited to opted-in in-app/browser alerts while the app is open; remote delivery is out of scope. Production hosting, recovery, and security review remain pending separately.</w:t>
       </w:r>
     </w:p>
     <w:tbl>
@@ -1191,11 +1163,9 @@
           <w:b/>
           <w:color w:val="AA6900"/>
         </w:rPr>
-        <w:t xml:space="preserve">IN PROGRESS  </w:t>
-      </w:r>
-      <w:r>
-        <w:t>PostgreSQL/Neon configuration and migration foundation exist, but no live PostgreSQL/Neon test is recorded. Tracker reports SQLite Alembic upgrade and PostgreSQL offline SQL generation only.</w:t>
-      </w:r>
+        <w:t>VERIFIED ON NEON  PostgreSQL support includes asyncpg URL normalization, client TLS, Neon `sslmode` conversion, asyncpg-unsupported `channel_binding` removal, and credential-safe `python -m app.cli db-status`. Alembic is at head `f54d2e96b1c7`; all eight expected tables exist. Naveen and Alekhya plus their imported connected data were verified against the SQLite source. The live API integration test creates uniquely named test rows and removes those rows in scoped cleanup. Production deployment/migration is not verified.</w:t>
+      </w:r>
+      <w:r/>
     </w:p>
     <w:p>
       <w:r>
@@ -1209,7 +1179,7 @@
     </w:p>
     <w:p>
       <w:r>
-        <w:t>•  Existing SQLite data is not automatically copied to PostgreSQL. Plan a one-time migration and verify counts, FKs, decimals, dates, users and groups.</w:t>
+        <w:t>•  The approved one-time SQLite-to-Neon import has been applied and independently verified for IDs, fields, hashes, relationships, and row counts. Future source changes are not automatically synchronized.</w:t>
       </w:r>
     </w:p>
     <w:p>
@@ -1248,10 +1218,10 @@
           <w:b/>
           <w:color w:val="AA6900"/>
         </w:rPr>
-        <w:t xml:space="preserve">IN PROGRESS  </w:t>
-      </w:r>
-      <w:r>
-        <w:t>Authorization tests and frontend admin tests are present and pass. The database health endpoint reports connectivity and Alembic revisions; live PostgreSQL status is unverified.</w:t>
+        <w:t xml:space="preserve">VERIFIED ON DISPOSABLE NEON  </w:t>
+      </w:r>
+      <w:r>
+        <w:t>Authorization tests and frontend admin tests pass. The live database health endpoint reported connection and current Alembic revisions; the live integration scenario passed. Production admin/deployment operations remain unverified.</w:t>
       </w:r>
     </w:p>
     <w:p>
@@ -1337,14 +1307,7 @@
     </w:p>
     <w:p>
       <w:r>
-        <w:rPr>
-          <w:b/>
-          <w:color w:val="AA6900"/>
-        </w:rPr>
-        <w:t xml:space="preserve">IN PROGRESS  </w:t>
-      </w:r>
-      <w:r>
-        <w:t>Both directions, payment visibility, history, privacy and linkage have automated coverage. Repeat realistic browser scenarios for both users before calling the full flow manually verified.</w:t>
+        <w:t>DONE / VERIFIED  The two-user Playwright flow verified both settlement directions, payment visibility, history, privacy, and source linkage using realistic group members. Production or live-user acceptance remains outside the automated evidence.</w:t>
       </w:r>
     </w:p>
     <w:p>
@@ -1410,14 +1373,7 @@
     </w:p>
     <w:p>
       <w:r>
-        <w:rPr>
-          <w:b/>
-          <w:color w:val="AA6900"/>
-        </w:rPr>
-        <w:t xml:space="preserve">IN PROGRESS  </w:t>
-      </w:r>
-      <w:r>
-        <w:t>Real-route integration tests cover two users/two groups and selected budget/filter/analytics/forecast/privacy/CSV/settlement flows using isolated SQLite. This does not prove that a separate browser app used this checkout or database.</w:t>
+        <w:t>VERIFIED ON NEON  Live PostgreSQL route integration covers two users/groups and budget, transaction, analytics, forecast, privacy, CSV and settlement flows with scoped fixture cleanup. The Playwright browser E2E separately covers the same core flows on isolated SQLite; it never writes synthetic browser accounts into Neon.</w:t>
       </w:r>
     </w:p>
     <w:p>
@@ -1468,12 +1424,12 @@
     </w:p>
     <w:p>
       <w:r>
-        <w:t>IMPLEMENTED; AUTOMATED TESTS VERIFIED  Authenticated GET /api/v1/transactions/export shares list-query authorization, visibility and filters. Stable headers include IDs, date, decimal amount, type, description, category, payer, recorder, group, notes, settlement flag and timestamps. Tests cover filters, authorization/privacy, empty output, headers, dates and decimals. UI passes current filters and downloads CSV. User-reported download success is recorded; independent browser/file inspection remains unverified.</w:t>
-      </w:r>
-    </w:p>
-    <w:p>
-      <w:r>
-        <w:t>IMPLEMENTED; AUTOMATED TESTS VERIFIED  Frontend uses the existing xlsx library to create a workbook Blob with XLSX MIME type and .xlsx name. Tests parse the bytes back as a workbook and check filtered export. Opening and inspecting the actual saved file in Excel/XLSX reader remains PENDING.</w:t>
+        <w:t>DONE / VERIFIED  Authenticated GET /api/v1/transactions/export shares list-query authorization, visibility, and filters. Tests cover filters, privacy, empty output, headers, dates, and decimals. The two-user Playwright run downloaded and parsed actual CSV and XLSX files and verified expected headers/data.</w:t>
+      </w:r>
+    </w:p>
+    <w:p>
+      <w:r>
+        <w:t>VERIFIED  Frontend uses the existing xlsx library to create a workbook Blob with XLSX MIME type and .xlsx name. Tests parse the bytes back as a workbook and check filtered export. Opening and inspecting the actual saved file in Excel/XLSX reader remains PENDING.</w:t>
       </w:r>
     </w:p>
     <w:p>
@@ -1496,17 +1452,17 @@
     </w:p>
     <w:p>
       <w:r>
-        <w:t>•  Backend `cd backend; pytest`: latest recorded run had 84 passing tests. Tests use isolated SQLite, not PostgreSQL integration.</w:t>
-      </w:r>
-    </w:p>
-    <w:p>
-      <w:r>
-        <w:t>•  Frontend `cd frontend; npm test`: latest recorded run had 91 passing Vitest/RTL tests, including admin, budget, dashboard consistency, dropdown/theme, exports and transaction presentation.</w:t>
-      </w:r>
-    </w:p>
-    <w:p>
-      <w:r>
-        <w:t>•  Build `cd frontend; npm run build`: TypeScript and Vite pass; main minified JS chunk exceeds 500 kB warning.</w:t>
+        <w:t>•  Backend `cd backend; pytest`: latest default suite 88 passed, 1 live-PostgreSQL test skipped by opt-in guard (327 warnings); separate Neon live test passed (1 passed, 52 JWT deprecation warnings) with scoped fixture cleanup.</w:t>
+      </w:r>
+    </w:p>
+    <w:p>
+      <w:r>
+        <w:t>•  Frontend `cd frontend; npm test`: latest run had 92 passing Vitest/RTL tests, including the budget-copy interaction test that verifies no write occurs until explicit save.</w:t>
+      </w:r>
+    </w:p>
+    <w:p>
+      <w:r>
+        <w:t>•  Build `cd frontend; npm run build`: TypeScript and Vite pass. Route splitting reduced the entry chunk to 379.99 kB (119.33 kB gzip); Analytics is 389.68 kB and XLSX is 423.99 kB, each loaded as separate chunks.</w:t>
       </w:r>
     </w:p>
     <w:p>
@@ -1516,7 +1472,7 @@
     </w:p>
     <w:p>
       <w:r>
-        <w:t>•  No Playwright/Cypress E2E setup was found in package configuration. Browser smoke/manual tests must first verify checkout, processes, base URL and database.</w:t>
+        <w:t>•  Playwright is configured at frontend/playwright.config.ts. `npm run test:e2e` starts a disposable in-memory SQLite backend and Vite on port 5174; it does not write to Neon.</w:t>
       </w:r>
     </w:p>
     <w:p>
@@ -1526,7 +1482,7 @@
     </w:p>
     <w:p>
       <w:r>
-        <w:t>Last recorded validation on 24 September 2026: backend 84 passed with 314 warnings (including python-jose UTC deprecation and SQLite foreign-key drop-order warnings); frontend 91 passed; production build passed with a bundle-size warning; `git diff --check` passed before the current documentation continuation. These checks do not establish live PostgreSQL support or full browser E2E completion.</w:t>
+        <w:t>Latest validation (25 September 2026): backend 88 passed / 1 opt-in Neon test skipped by default; separate live Neon test 1 passed. Frontend tests 92/92, production build, Playwright two-user browser E2E, and `git diff --check` passed. Neon TLS and Alembic head f54d2e96b1c7 verified; imported counts remain users=2, groups=1, transactions=57. The Playwright flow uses isolated in-memory SQLite; Neon is exercised by the separate live API integration test.</w:t>
       </w:r>
     </w:p>
     <w:p>
@@ -1539,7 +1495,7 @@
     </w:p>
     <w:p>
       <w:r>
-        <w:t>•  Reported cross-screen budget/transactions/analytics/forecast mismatches remain unresolved for the previously used runtime because checkout and active DB were not conclusively identified. Isolated API/browser smoke does not prove old local data is correct.</w:t>
+        <w:t>•  An earlier pre-existing localhost service on ports 5173/8000 displayed a budget discrepancy (Settings vs Dashboard). It was not modified; identify the intended checkout/database and manually recheck that local service before relying on it. Isolated E2E and live Neon API checks passed independently.</w:t>
       </w:r>
     </w:p>
     <w:p>
@@ -1549,7 +1505,7 @@
     </w:p>
     <w:p>
       <w:r>
-        <w:t>•  PostgreSQL/Neon was not tested live. SQLite compatibility and offline SQL generation are not proof.</w:t>
+        <w:t>•  Neon connection, client TLS, Alembic head, SQLite data import, read-only record comparison, and real-route API integration passed. Production deployment, backup/restore and production security remain unverified.</w:t>
       </w:r>
     </w:p>
     <w:p>
@@ -1574,12 +1530,12 @@
     </w:p>
     <w:p>
       <w:r>
-        <w:t>•  Vite build has a &gt;500 kB main chunk warning; build succeeds.</w:t>
-      </w:r>
-    </w:p>
-    <w:p>
-      <w:r>
-        <w:t>•  The locally known main/origin/main baseline is 77f7183; live remote state could not be refreshed. Always inspect current Git status before work because new local edits may exist.</w:t>
+        <w:t>•  The initial Vite entry bundle was reduced by route-level splitting; current measured entry is 379.99 kB raw (119.33 kB gzip), with Analytics and XLSX as lazy chunks.</w:t>
+      </w:r>
+    </w:p>
+    <w:p>
+      <w:r>
+        <w:t>•  This checkout is on `main` at local baseline `87c40183`; current Phase 2 implementation, tests, and documentation changes are uncommitted. Do not reset, commit, or push without explicit instruction. Remote tip was not refreshed for this continuation.</w:t>
       </w:r>
     </w:p>
     <w:p>
@@ -1638,7 +1594,7 @@
     </w:p>
     <w:p>
       <w:r>
-        <w:t>•  PostgreSQL async driver/configuration, Alembic additions, admin CLI/API/UI and migration health; live PostgreSQL remains unverified.</w:t>
+        <w:t>•  PostgreSQL async driver/configuration, Alembic additions, admin CLI/API/UI, migration health, and SQLite-to-Neon data migration are verified against the configured Neon database; production remains unverified.</w:t>
       </w:r>
     </w:p>
     <w:p>
@@ -1648,7 +1604,7 @@
     </w:p>
     <w:p>
       <w:r>
-        <w:t>•  Filtered CSV endpoint and XLSX workbook generation plus automated tests; saved-file browser verification is still open for XLSX.</w:t>
+        <w:t>•  Filtered CSV endpoint and XLSX workbook generation passed automated tests; the two-user Playwright flow downloaded and parsed both saved file formats.</w:t>
       </w:r>
     </w:p>
     <w:p>
@@ -1658,7 +1614,7 @@
     </w:p>
     <w:p>
       <w:r>
-        <w:t>Commit 77f7183 adds environment-example guidance and is the latest commit in the local main/origin/main refs. The live remote tip was not independently refreshed. All commits described here belong to SharedSpend-clone; none updates the private SharedSpend repository. Live database and manual browser checks remain open.</w:t>
+        <w:t>Commit 87c40183 remains the local main/origin/main baseline. All current working-tree changes are uncommitted and unpushed. Neon import and read-only status checks are verified; the live GitHub tip was not refreshed during this review.</w:t>
       </w:r>
     </w:p>
     <w:p>
@@ -1666,47 +1622,47 @@
         <w:pStyle w:val="Heading1"/>
       </w:pPr>
       <w:r>
-        <w:t>23. Exact next steps in priority order</w:t>
-      </w:r>
-    </w:p>
-    <w:p>
-      <w:r>
-        <w:t>1.  Inspect Git status, AGENTS.md, tracker and diffs. Keep all work in SharedSpend-clone and preserve existing edits.</w:t>
-      </w:r>
-    </w:p>
-    <w:p>
-      <w:r>
-        <w:t>2.  Identify 5173/8000 listeners, command lines/workdirs, frontend API URL, backend SHA and active DB path/URL with secrets redacted. Start this checkout only after identifying stale processes.</w:t>
-      </w:r>
-    </w:p>
-    <w:p>
-      <w:r>
-        <w:t>3.  Use same authenticated user, Home group, September 2026, database and matching filters. Compare API and browser budget, shared transactions, summary, analytics, forecast, settlement and both members’ privacy.</w:t>
-      </w:r>
-    </w:p>
-    <w:p>
-      <w:r>
-        <w:t>4.  If a code/data defect is proven, make a targeted fix plus real-route regression; repeat browser test. Do not call old mismatch fixed from tests alone.</w:t>
-      </w:r>
-    </w:p>
-    <w:p>
-      <w:r>
-        <w:t>5.  Complete remaining Phase 2 checks: independent CSV browser/file inspection, saved XLSX opening, budget copy/save, dark mode every screen/mobile, both settlement directions/history/privacy, and decide whether alerts need background delivery.</w:t>
-      </w:r>
-    </w:p>
-    <w:p>
-      <w:r>
-        <w:t>6.  Decide whether LLM categorization, background alerts, and global admin UI are needed for this private product; decide whether shared PostgreSQL is required.</w:t>
-      </w:r>
-    </w:p>
-    <w:p>
-      <w:r>
-        <w:t>7.  If PostgreSQL is required, test a disposable live PostgreSQL database: migrations and API flows; verify decimals/dates/JSON/FKs/privacy and provider pooling/SSL. Never use production data for tests.</w:t>
-      </w:r>
-    </w:p>
-    <w:p>
-      <w:r>
-        <w:t>8.  Run backend pytest, frontend npm test/build, migration/schema checks, real API scenarios, manual browser checks, and git diff --check; review full diff.</w:t>
+        <w:t>23. Next steps after Phase 2</w:t>
+      </w:r>
+    </w:p>
+    <w:p>
+      <w:r>
+        <w:t>1.  Manually identify the intended local checkout/database behind the previously observed localhost budget discrepancy, then compare Settings, Dashboard, and Forecast for the Naveen/Alekhya group. Do not clean up any local test rows until identified.</w:t>
+      </w:r>
+    </w:p>
+    <w:p>
+      <w:r>
+        <w:t>2.  If using local services, verify their checkout, listening ports, database target and API URL with credentials redacted; do not stop or clean the older service/data without explicit approval.</w:t>
+      </w:r>
+    </w:p>
+    <w:p>
+      <w:r>
+        <w:t>3.  Before broader/shared use, schedule production hosting, security review, and backup/restore work.</w:t>
+      </w:r>
+    </w:p>
+    <w:p>
+      <w:r>
+        <w:t>4.  Keep the app-open alert behavior; consider background push/email only if explicitly added to scope.</w:t>
+      </w:r>
+    </w:p>
+    <w:p>
+      <w:r>
+        <w:t>5.  Phase 2 is complete for the agreed scope; do not begin Phase 3 until explicitly directed.</w:t>
+      </w:r>
+    </w:p>
+    <w:p>
+      <w:r>
+        <w:t>6.  Rule-based categorization remains the current implementation; no LLM categorization is claimed. Global admin is an operational control, not a household feature requirement.</w:t>
+      </w:r>
+    </w:p>
+    <w:p>
+      <w:r>
+        <w:t>7.  Neon data migration and validation completed: Alembic is at head `f54d2e96b1c7`, TLS is enabled, and read-only comparison confirms 2 users, 1 group, 2 memberships, 57 transactions, 1 budget, 2 settlements, 7 global categories, and 2 group categories with preserved IDs/relationships and password hashes. The live PostgreSQL test cleans up its own synthetic fixtures. Do not run tests against production or personal data.</w:t>
+      </w:r>
+    </w:p>
+    <w:p>
+      <w:r>
+        <w:t>8.  Keep production migration, backup/restore, monitoring and security reviews separate from this development checkout.</w:t>
       </w:r>
     </w:p>
     <w:p>
@@ -1737,6 +1693,111 @@
     <w:p>
       <w:r>
         <w:t>Immediate goal: trustworthy personal use by a small invited group. Reliability, continuity, privacy and clear manual validation take priority over expanding the feature list.</w:t>
+      </w:r>
+    </w:p>
+    <w:p>
+      <w:pPr>
+        <w:pStyle w:val="Heading1"/>
+      </w:pPr>
+      <w:r>
+        <w:t>Current Phase 2 Status September 25 2026</w:t>
+      </w:r>
+    </w:p>
+    <w:p>
+      <w:pPr>
+        <w:spacing w:after="120"/>
+      </w:pPr>
+      <w:r>
+        <w:t>This dated status supersedes earlier time-sensitive test results, open checklists, and next-step lists in this handoff. Phase 2 is complete for the agreed private friends-and-family web application scope. Phase 3 has not started.</w:t>
+      </w:r>
+    </w:p>
+    <w:p>
+      <w:pPr>
+        <w:pStyle w:val="Heading2"/>
+      </w:pPr>
+      <w:r>
+        <w:t>Implementation and verification</w:t>
+      </w:r>
+    </w:p>
+    <w:p>
+      <w:pPr>
+        <w:spacing w:after="120"/>
+      </w:pPr>
+      <w:r>
+        <w:t>IMPLEMENTED: budget copy, CSV/XLSX exports, app-open budget alerts, dark mode, analytics query consolidation, route-level lazy loading, and the Playwright browser test setup. VERIFIED: the full two-user browser flow passed, including budget copy/save/reload, group-scoped transactions, Dashboard/Analytics/Forecast consistency, 80% and 100% budget alerts, settlements and payment history, saved CSV and XLSX downloads, dark-mode persistence and chart rendering, and a 390 px layout check.</w:t>
+      </w:r>
+    </w:p>
+    <w:p>
+      <w:pPr>
+        <w:spacing w:after="120"/>
+      </w:pPr>
+      <w:r>
+        <w:t>Backend validation passed with 98 tests and one opt-in live PostgreSQL test skipped in the default run. The separate live Neon integration test passed in the Phase 2 validation record. Frontend tests passed 92/92, the production build passed, and the Playwright E2E passed with two browser users and an isolated SQLite database. Neon remains at Alembic head f54d2e96b1c7 with TLS enabled; its imported users and records were preserved.</w:t>
+      </w:r>
+    </w:p>
+    <w:p>
+      <w:pPr>
+        <w:pStyle w:val="Heading2"/>
+      </w:pPr>
+      <w:r>
+        <w:t>Neon latency findings</w:t>
+      </w:r>
+    </w:p>
+    <w:p>
+      <w:pPr>
+        <w:spacing w:after="120"/>
+      </w:pPr>
+      <w:r>
+        <w:t>A cold Neon pooled connection plus SELECT 1 took 1.24 seconds in the latest read-only check; an earlier sample coincided with the database resuming from scale-to-zero. A small matched route benchmark reduced Dashboard summary SQL statements from 8 to 4, forecast from 4 to 3, and member analytics from 8 to 3. Summary, forecast, and member route medians improved in that sample; Insights fell from 7 to 4 statements but its route median did not improve, showing that Neon/network variance remains. The sample is diagnostic, not a performance guarantee. The initial JavaScript entry decreased from 1,069 kB (317 kB gzip) to 380 kB (119 kB gzip); Analytics and XLSX are lazy chunks.</w:t>
+      </w:r>
+    </w:p>
+    <w:p>
+      <w:pPr>
+        <w:pStyle w:val="Heading2"/>
+      </w:pPr>
+      <w:r>
+        <w:t>Remaining scope</w:t>
+      </w:r>
+    </w:p>
+    <w:p>
+      <w:pPr>
+        <w:spacing w:after="120"/>
+      </w:pPr>
+      <w:r>
+        <w:t>No agreed Phase 2 feature or automated E2E acceptance item remains open. Browser alerts are intentionally limited to the opted-in user while the app is open; background email or push is outside the agreed Phase 2 scope. Production hosting, security review, and backup/restore testing remain separate operational work.</w:t>
+      </w:r>
+    </w:p>
+    <w:p>
+      <w:pPr>
+        <w:pStyle w:val="Heading1"/>
+      </w:pPr>
+      <w:r>
+        <w:t>Render Deployment Preparation September 25 2026</w:t>
+      </w:r>
+    </w:p>
+    <w:p>
+      <w:r>
+        <w:t>IMPLEMENTED LOCALLY, NOT DEPLOYED  The repository now has a Render Blueprint at sharedspend/render.yaml. It defines a FastAPI web service and a Vite static site. The application continues to use the existing external Neon PostgreSQL database; the Blueprint does not create or migrate to a Render database.</w:t>
+      </w:r>
+    </w:p>
+    <w:p>
+      <w:r>
+        <w:t>The backend service uses Python 3.12.14, installs backend/requirements.txt, applies Alembic migrations during startup, serves app.main:app on Render’s assigned port, and checks /health. Startup migrations assume one running backend instance. The static service builds the existing frontend, publishes dist, rewrites client routes to index.html, and obtains VITE_API_BASE_URL from the backend service’s public Render URL.</w:t>
+      </w:r>
+    </w:p>
+    <w:p>
+      <w:r>
+        <w:t>At initial Blueprint setup, enter DATABASE_URL and a unique production SECRET_KEY through the Render Dashboard. Set CORS_ORIGINS to the exact HTTPS origin of the deployed frontend; update it after Render assigns that origin if necessary. The backend production configuration rejects placeholder/weak secrets, SQLite, wildcard CORS, and non-HTTPS or local origins. Do not place secrets in the repository, frontend build variables, logs, or support messages.</w:t>
+      </w:r>
+    </w:p>
+    <w:p>
+      <w:r>
+        <w:t>Local validation on September 25: backend 98 passed and 1 opt-in live test skipped; frontend 92 passed; Playwright E2E 1 passed on isolated SQLite; production build passed; the Blueprint YAML parsed and structural checks passed. Render CLI/schema validation, dashboard provisioning, and deployment were not performed because no Render CLI/account credentials were used. The live Neon database was not changed for this preparation.</w:t>
+      </w:r>
+    </w:p>
+    <w:p>
+      <w:r>
+        <w:t>Next: after the local commit is pushed by the repository owner, create a Render Blueprint from the GitHub repository and set the Blueprint path to sharedspend/render.yaml. Supply the existing Neon URL, production secret, and exact frontend CORS origin in the Dashboard. Check backend /health, frontend routing, login, and the core group/budget/transaction flows. Free Render services can sleep when inactive and are intended for evaluation rather than production reliability; select a suitable plan before depending on the service.</w:t>
       </w:r>
     </w:p>
     <w:sectPr>

</xml_diff>